<commit_message>
docs(parceria-cna): remove piloto, nome completo do Observatório e roteiro v3
- Proposta, nota técnica, ofício e deck: o piloto de 60 dias sai e entra
  "Como contratar" (Ficha por estado -> assinatura do Radar -> Carteira).
  Valores e formato de contratação a definir.
- Nome completo: Observatório de Infraestrutura de Transportes.
- Roteiro: cena 3 com o acerto de Itacoatiara (6,29 m em 26/09), cena 4
  com o exemplo de setembro (previsto -10%, realizado -13%), cena 8
  "Como começar" com 25 s (total 4:25).
- Storyboard do vídeo incluído.

Co-Authored-By: Claude Opus 5.5 <noreply@anthropic.com>
</commit_message>
<xml_diff>
--- a/docs/parceria-cna/OFICIO xxx-CNA-Joao-Martins-Radar-Logistico.docx
+++ b/docs/parceria-cna/OFICIO xxx-CNA-Joao-Martins-Radar-Logistico.docx
@@ -117,7 +117,7 @@
         <w:jc w:val="both"/>
       </w:pPr>
       <w:r>
-        <w:t xml:space="preserve">O debate sobre a logística do agronegócio é hoje conduzido, em regra, com números nacionais e anuais, que se tornam disponíveis depois que os gargalos já se manifestaram. Produtores, federações e parlamentares não dispõem de informação antecipada, na escala do município, sobre onde o escoamento tende a travar, quanto isso custa e qual obra ou medida deveria ser priorizada. O Observatório de Infraestrutura do IBI, que já mantém com dados públicos o Monitor Hidrológico da Bacia do Amazonas e o Índice de Estresse de Escoamento dos corredores de Santos, Paranaguá e Arco Norte, propõe-se a suprir essa lacuna em conjunto com a CNA.</w:t>
+        <w:t xml:space="preserve">O debate sobre a logística do agronegócio é hoje conduzido, em regra, com números nacionais e anuais, que se tornam disponíveis depois que os gargalos já se manifestaram. Produtores, federações e parlamentares não dispõem de informação antecipada, na escala do município, sobre onde o escoamento tende a travar, quanto isso custa e qual obra ou medida deveria ser priorizada. O Observatório de Infraestrutura de Transportes do IBI, que já mantém com dados públicos o Monitor Hidrológico da Bacia do Amazonas e o Índice de Estresse de Escoamento dos corredores de Santos, Paranaguá e Arco Norte, propõe-se a suprir essa lacuna em conjunto com a CNA.</w:t>
       </w:r>
     </w:p>
     <w:p>
@@ -207,10 +207,10 @@
         <w:rPr>
           <w:b/>
         </w:rPr>
-        <w:t xml:space="preserve">Piloto de 90 dias. </w:t>
-      </w:r>
-      <w:r>
-        <w:t xml:space="preserve">Propõe-se um piloto de 90 dias compreendendo: (1) fichas municipais de um estado-piloto, elaboradas com uma federação parceira; (2) a primeira edição mensal do Radar, após a adequação do modelo à nova regra de obrigatoriedade do registro de frete; (3) a primeira edição da Carteira de Prioridades, com o custo de inação das obras preenchido, uma vez que, na apuração interna, apenas 2 das 12 obras avaliadas dispõem hoje de dados públicos suficientes para o ordenamento; e (4) o encaminhamento de ofício conjunto IBI e CNA à ANTT sobre a publicação agregada do valor do frete.</w:t>
+        <w:t xml:space="preserve">Como contratar. </w:t>
+      </w:r>
+      <w:r>
+        <w:t xml:space="preserve">Propõe-se começar pela Ficha Logística por estado, com fichas de todos os municípios produtores, entregues em cerca de 30 dias e contratadas pelas federações, com a CNA como canal e co-assinatura; seguir com a assinatura do Radar do Escoamento por 12 meses; e contratar a Carteira de Prioridades quando o método estiver validado.</w:t>
       </w:r>
     </w:p>
     <w:p>
@@ -219,7 +219,7 @@
         <w:jc w:val="both"/>
       </w:pPr>
       <w:r>
-        <w:t xml:space="preserve">Sugere-se, como instrumento, a celebração de acordo de cooperação técnica, com modelo de financiamento e governança a serem definidos entre as partes. Para tanto, o IBI coloca-se à disposição para apresentar a proposta em detalhe à equipe técnica da CNA e solicita a indicação de interlocutor técnico para a elaboração conjunta do plano de trabalho.</w:t>
+        <w:t xml:space="preserve">Os valores e o formato de contratação seriam definidos entre as partes.</w:t>
       </w:r>
     </w:p>
     <w:p>

</xml_diff>